<commit_message>
docs: add Requirements.md sign off from UX designer, edit Sprint 0 design doc to reviewed changes, add Sprint0DesignDocBackground.md with General notes and a sign off section
</commit_message>
<xml_diff>
--- a/docs/Sprint 0 Design Document.docx
+++ b/docs/Sprint 0 Design Document.docx
@@ -72,6 +72,7 @@
       </w:pPr>
       <w:r>
         <w:rPr>
+          <w:noProof/>
           <w:sz w:val="28"/>
           <w:szCs w:val="28"/>
           <w:lang w:val="en-US"/>
@@ -189,15 +190,7 @@
           <w:szCs w:val="24"/>
           <w:lang w:val="en-US"/>
         </w:rPr>
-        <w:t>#</w:t>
-      </w:r>
-      <w:r>
-        <w:rPr>
-          <w:sz w:val="24"/>
-          <w:szCs w:val="24"/>
-          <w:lang w:val="en-US"/>
-        </w:rPr>
-        <w:t>63ABF2</w:t>
+        <w:t>#63ABF2</w:t>
       </w:r>
     </w:p>
     <w:p>
@@ -387,6 +380,7 @@
       </w:pPr>
       <w:r>
         <w:rPr>
+          <w:noProof/>
           <w:sz w:val="28"/>
           <w:szCs w:val="28"/>
           <w:lang w:val="en-US"/>
@@ -606,6 +600,108 @@
           <w:lang w:val="en-US"/>
         </w:rPr>
         <w:t>The team members cards are displayed in a flex box manner, according to screen width</w:t>
+      </w:r>
+    </w:p>
+    <w:p>
+      <w:pPr>
+        <w:rPr>
+          <w:sz w:val="24"/>
+          <w:szCs w:val="24"/>
+          <w:lang w:val="en-US"/>
+        </w:rPr>
+      </w:pPr>
+    </w:p>
+    <w:p>
+      <w:pPr>
+        <w:rPr>
+          <w:sz w:val="24"/>
+          <w:szCs w:val="24"/>
+          <w:lang w:val="en-US"/>
+        </w:rPr>
+      </w:pPr>
+      <w:r>
+        <w:rPr>
+          <w:sz w:val="24"/>
+          <w:szCs w:val="24"/>
+          <w:lang w:val="en-US"/>
+        </w:rPr>
+        <w:t>Team Page Wireframe – Mobile Screen size and Dummy Data</w:t>
+      </w:r>
+    </w:p>
+    <w:p>
+      <w:pPr>
+        <w:rPr>
+          <w:sz w:val="24"/>
+          <w:szCs w:val="24"/>
+          <w:lang w:val="en-US"/>
+        </w:rPr>
+      </w:pPr>
+      <w:r>
+        <w:rPr>
+          <w:sz w:val="24"/>
+          <w:szCs w:val="24"/>
+          <w:lang w:val="en-US"/>
+        </w:rPr>
+        <w:drawing>
+          <wp:inline distT="0" distB="0" distL="0" distR="0" wp14:anchorId="7597F1A3" wp14:editId="0EF64368">
+            <wp:extent cx="2343393" cy="5097780"/>
+            <wp:effectExtent l="0" t="0" r="0" b="7620"/>
+            <wp:docPr id="849880433" name="Picture 1"/>
+            <wp:cNvGraphicFramePr>
+              <a:graphicFrameLocks xmlns:a="http://schemas.openxmlformats.org/drawingml/2006/main" noChangeAspect="1"/>
+            </wp:cNvGraphicFramePr>
+            <a:graphic xmlns:a="http://schemas.openxmlformats.org/drawingml/2006/main">
+              <a:graphicData uri="http://schemas.openxmlformats.org/drawingml/2006/picture">
+                <pic:pic xmlns:pic="http://schemas.openxmlformats.org/drawingml/2006/picture">
+                  <pic:nvPicPr>
+                    <pic:cNvPr id="849880433" name=""/>
+                    <pic:cNvPicPr/>
+                  </pic:nvPicPr>
+                  <pic:blipFill>
+                    <a:blip r:embed="rId7"/>
+                    <a:stretch>
+                      <a:fillRect/>
+                    </a:stretch>
+                  </pic:blipFill>
+                  <pic:spPr>
+                    <a:xfrm>
+                      <a:off x="0" y="0"/>
+                      <a:ext cx="2346931" cy="5105477"/>
+                    </a:xfrm>
+                    <a:prstGeom prst="rect">
+                      <a:avLst/>
+                    </a:prstGeom>
+                  </pic:spPr>
+                </pic:pic>
+              </a:graphicData>
+            </a:graphic>
+          </wp:inline>
+        </w:drawing>
+      </w:r>
+    </w:p>
+    <w:p>
+      <w:pPr>
+        <w:rPr>
+          <w:sz w:val="24"/>
+          <w:szCs w:val="24"/>
+          <w:lang w:val="en-US"/>
+        </w:rPr>
+      </w:pPr>
+      <w:r>
+        <w:rPr>
+          <w:sz w:val="24"/>
+          <w:szCs w:val="24"/>
+          <w:lang w:val="en-US"/>
+        </w:rPr>
+        <w:t xml:space="preserve">Built on the Team Page Wireframe, this wireframe shows </w:t>
+      </w:r>
+      <w:r>
+        <w:rPr>
+          <w:sz w:val="24"/>
+          <w:szCs w:val="24"/>
+          <w:lang w:val="en-US"/>
+        </w:rPr>
+        <w:t>a team card with dummy data and a mobile format, where the team cards stack on top of each other in a flex style</w:t>
       </w:r>
     </w:p>
     <w:sectPr>

</xml_diff>